<commit_message>
Updated test plans with final two tests for week 7
</commit_message>
<xml_diff>
--- a/module-7/TestPlanModule7.docx
+++ b/module-7/TestPlanModule7.docx
@@ -218,9 +218,10 @@
               <w:pStyle w:val="NoSpacing"/>
               <w:spacing w:before="80" w:after="80"/>
               <w:rPr>
-                <w:rFonts w:ascii="Arial" w:hAnsi="Arial" w:cs="Arial"/>
-                <w:sz w:val="20"/>
-                <w:szCs w:val="20"/>
+                <w:rFonts w:ascii="Arial" w:hAnsi="Arial" w:cs="Arial" w:hint="eastAsia"/>
+                <w:sz w:val="20"/>
+                <w:szCs w:val="20"/>
+                <w:lang w:eastAsia="ja-JP"/>
               </w:rPr>
             </w:pPr>
             <w:r>
@@ -248,7 +249,17 @@
                 <w:sz w:val="20"/>
                 <w:szCs w:val="20"/>
               </w:rPr>
-              <w:t>2026/10/22</w:t>
+              <w:t>2026/10/2</w:t>
+            </w:r>
+            <w:r>
+              <w:rPr>
+                <w:rFonts w:ascii="Arial" w:hAnsi="Arial" w:cs="Arial" w:hint="eastAsia"/>
+                <w:color w:val="C00000"/>
+                <w:sz w:val="20"/>
+                <w:szCs w:val="20"/>
+                <w:lang w:eastAsia="ja-JP"/>
+              </w:rPr>
+              <w:t>5</w:t>
             </w:r>
           </w:p>
         </w:tc>
@@ -314,6 +325,7 @@
       </w:sdtPr>
       <w:sdtEndPr>
         <w:rPr>
+          <w:rFonts w:eastAsiaTheme="minorEastAsia"/>
           <w:b/>
           <w:bCs/>
           <w:noProof/>
@@ -345,8 +357,12 @@
               <w:tab w:val="right" w:leader="dot" w:pos="12950"/>
             </w:tabs>
             <w:rPr>
-              <w:rFonts w:eastAsiaTheme="minorEastAsia"/>
               <w:noProof/>
+              <w:kern w:val="2"/>
+              <w:sz w:val="24"/>
+              <w:szCs w:val="24"/>
+              <w:lang w:eastAsia="ja-JP"/>
+              <w14:ligatures w14:val="standardContextual"/>
             </w:rPr>
           </w:pPr>
           <w:r>
@@ -367,7 +383,7 @@
             </w:rPr>
             <w:fldChar w:fldCharType="separate"/>
           </w:r>
-          <w:hyperlink w:anchor="_Toc132718195" w:history="1">
+          <w:hyperlink w:anchor="_Toc243839461" w:history="1">
             <w:r>
               <w:rPr>
                 <w:rStyle w:val="Hyperlink"/>
@@ -376,7 +392,7 @@
                 <w:bCs/>
                 <w:noProof/>
               </w:rPr>
-              <w:t>&lt;DESCRIPTION&gt;</w:t>
+              <w:t>Confirm Booking</w:t>
             </w:r>
             <w:r>
               <w:rPr>
@@ -397,7 +413,7 @@
                 <w:noProof/>
                 <w:webHidden/>
               </w:rPr>
-              <w:instrText xml:space="preserve"> PAGEREF _Toc132718195 \h </w:instrText>
+              <w:instrText xml:space="preserve"> PAGEREF _Toc243839461 \h </w:instrText>
             </w:r>
             <w:r>
               <w:rPr>
@@ -435,11 +451,15 @@
               <w:tab w:val="right" w:leader="dot" w:pos="12950"/>
             </w:tabs>
             <w:rPr>
-              <w:rFonts w:eastAsiaTheme="minorEastAsia"/>
               <w:noProof/>
+              <w:kern w:val="2"/>
+              <w:sz w:val="24"/>
+              <w:szCs w:val="24"/>
+              <w:lang w:eastAsia="ja-JP"/>
+              <w14:ligatures w14:val="standardContextual"/>
             </w:rPr>
           </w:pPr>
-          <w:hyperlink w:anchor="_Toc132718196" w:history="1">
+          <w:hyperlink w:anchor="_Toc243839462" w:history="1">
             <w:r>
               <w:rPr>
                 <w:rStyle w:val="Hyperlink"/>
@@ -448,7 +468,7 @@
                 <w:bCs/>
                 <w:noProof/>
               </w:rPr>
-              <w:t>&lt;DESCRIPTION&gt;</w:t>
+              <w:t>Cancel Booking</w:t>
             </w:r>
             <w:r>
               <w:rPr>
@@ -469,7 +489,7 @@
                 <w:noProof/>
                 <w:webHidden/>
               </w:rPr>
-              <w:instrText xml:space="preserve"> PAGEREF _Toc132718196 \h </w:instrText>
+              <w:instrText xml:space="preserve"> PAGEREF _Toc243839462 \h </w:instrText>
             </w:r>
             <w:r>
               <w:rPr>
@@ -489,7 +509,7 @@
                 <w:noProof/>
                 <w:webHidden/>
               </w:rPr>
-              <w:t>2</w:t>
+              <w:t>3</w:t>
             </w:r>
             <w:r>
               <w:rPr>
@@ -507,11 +527,15 @@
               <w:tab w:val="right" w:leader="dot" w:pos="12950"/>
             </w:tabs>
             <w:rPr>
-              <w:rFonts w:eastAsiaTheme="minorEastAsia"/>
               <w:noProof/>
+              <w:kern w:val="2"/>
+              <w:sz w:val="24"/>
+              <w:szCs w:val="24"/>
+              <w:lang w:eastAsia="ja-JP"/>
+              <w14:ligatures w14:val="standardContextual"/>
             </w:rPr>
           </w:pPr>
-          <w:hyperlink w:anchor="_Toc132718197" w:history="1">
+          <w:hyperlink w:anchor="_Toc243839463" w:history="1">
             <w:r>
               <w:rPr>
                 <w:rStyle w:val="Hyperlink"/>
@@ -520,7 +544,7 @@
                 <w:bCs/>
                 <w:noProof/>
               </w:rPr>
-              <w:t>&lt;DESCRIPTION&gt;</w:t>
+              <w:t>Access “About Us” Page Directly</w:t>
             </w:r>
             <w:r>
               <w:rPr>
@@ -541,7 +565,7 @@
                 <w:noProof/>
                 <w:webHidden/>
               </w:rPr>
-              <w:instrText xml:space="preserve"> PAGEREF _Toc132718197 \h </w:instrText>
+              <w:instrText xml:space="preserve"> PAGEREF _Toc243839463 \h </w:instrText>
             </w:r>
             <w:r>
               <w:rPr>
@@ -562,6 +586,103 @@
                 <w:webHidden/>
               </w:rPr>
               <w:t>3</w:t>
+            </w:r>
+            <w:r>
+              <w:rPr>
+                <w:noProof/>
+                <w:webHidden/>
+              </w:rPr>
+              <w:fldChar w:fldCharType="end"/>
+            </w:r>
+          </w:hyperlink>
+        </w:p>
+        <w:p>
+          <w:pPr>
+            <w:pStyle w:val="TOC1"/>
+            <w:tabs>
+              <w:tab w:val="right" w:leader="dot" w:pos="12950"/>
+            </w:tabs>
+            <w:rPr>
+              <w:noProof/>
+              <w:kern w:val="2"/>
+              <w:sz w:val="24"/>
+              <w:szCs w:val="24"/>
+              <w:lang w:eastAsia="ja-JP"/>
+              <w14:ligatures w14:val="standardContextual"/>
+            </w:rPr>
+          </w:pPr>
+          <w:hyperlink w:anchor="_Toc243839464" w:history="1">
+            <w:r>
+              <w:rPr>
+                <w:rStyle w:val="Hyperlink"/>
+                <w:rFonts w:ascii="Arial" w:hAnsi="Arial" w:cs="Arial"/>
+                <w:b/>
+                <w:bCs/>
+                <w:noProof/>
+              </w:rPr>
+              <w:t>Access “About Us” Page from Home</w:t>
+            </w:r>
+            <w:r>
+              <w:rPr>
+                <w:rStyle w:val="Hyperlink"/>
+                <w:rFonts w:ascii="Arial" w:hAnsi="Arial" w:cs="Arial"/>
+                <w:b/>
+                <w:bCs/>
+                <w:noProof/>
+                <w:lang w:eastAsia="ja-JP"/>
+              </w:rPr>
+              <w:t xml:space="preserve"> P</w:t>
+            </w:r>
+            <w:r>
+              <w:rPr>
+                <w:rStyle w:val="Hyperlink"/>
+                <w:rFonts w:ascii="Arial" w:hAnsi="Arial" w:cs="Arial"/>
+                <w:b/>
+                <w:bCs/>
+                <w:noProof/>
+              </w:rPr>
+              <w:t>age</w:t>
+            </w:r>
+            <w:r>
+              <w:rPr>
+                <w:noProof/>
+                <w:webHidden/>
+              </w:rPr>
+              <w:tab/>
+            </w:r>
+            <w:r>
+              <w:rPr>
+                <w:noProof/>
+                <w:webHidden/>
+              </w:rPr>
+              <w:fldChar w:fldCharType="begin"/>
+            </w:r>
+            <w:r>
+              <w:rPr>
+                <w:noProof/>
+                <w:webHidden/>
+              </w:rPr>
+              <w:instrText xml:space="preserve"> PAGEREF _Toc243839464 \h </w:instrText>
+            </w:r>
+            <w:r>
+              <w:rPr>
+                <w:noProof/>
+                <w:webHidden/>
+              </w:rPr>
+            </w:r>
+            <w:r>
+              <w:rPr>
+                <w:noProof/>
+                <w:webHidden/>
+              </w:rPr>
+              <w:fldChar w:fldCharType="separate"/>
+            </w:r>
+            <w:r>
+              <w:rPr>
+                <w:noProof/>
+                <w:webHidden/>
+              </w:rPr>
+              <w:t>4</w:t>
             </w:r>
             <w:r>
               <w:rPr>
@@ -768,7 +889,6 @@
           <w:sz w:val="24"/>
           <w:szCs w:val="24"/>
         </w:rPr>
-        <w:lastRenderedPageBreak/>
         <w:t xml:space="preserve">For each test, the </w:t>
       </w:r>
       <w:r>
@@ -786,7 +906,25 @@
           <w:sz w:val="24"/>
           <w:szCs w:val="24"/>
         </w:rPr>
-        <w:t xml:space="preserve"> should:  provide a test description, a test objective, the developer name and date tested. </w:t>
+        <w:t xml:space="preserve"> should:  provide a test description, a test objective, the </w:t>
+      </w:r>
+      <w:proofErr w:type="gramStart"/>
+      <w:r>
+        <w:rPr>
+          <w:rFonts w:ascii="Arial" w:hAnsi="Arial" w:cs="Arial"/>
+          <w:sz w:val="24"/>
+          <w:szCs w:val="24"/>
+        </w:rPr>
+        <w:t>developer</w:t>
+      </w:r>
+      <w:proofErr w:type="gramEnd"/>
+      <w:r>
+        <w:rPr>
+          <w:rFonts w:ascii="Arial" w:hAnsi="Arial" w:cs="Arial"/>
+          <w:sz w:val="24"/>
+          <w:szCs w:val="24"/>
+        </w:rPr>
+        <w:t xml:space="preserve"> name and date tested. </w:t>
       </w:r>
       <w:r>
         <w:rPr>
@@ -921,6 +1059,7 @@
                 <w:color w:val="auto"/>
               </w:rPr>
             </w:pPr>
+            <w:bookmarkStart w:id="0" w:name="_Toc243839461"/>
             <w:r>
               <w:rPr>
                 <w:rFonts w:ascii="Arial" w:hAnsi="Arial" w:cs="Arial"/>
@@ -930,6 +1069,7 @@
               </w:rPr>
               <w:t>Confirm Booking</w:t>
             </w:r>
+            <w:bookmarkEnd w:id="0"/>
           </w:p>
         </w:tc>
       </w:tr>
@@ -1136,7 +1276,27 @@
                 <w:sz w:val="20"/>
                 <w:szCs w:val="20"/>
               </w:rPr>
-              <w:t>&lt;yyyy/mm/dd&gt;</w:t>
+              <w:t>&lt;</w:t>
+            </w:r>
+            <w:proofErr w:type="spellStart"/>
+            <w:r>
+              <w:rPr>
+                <w:rFonts w:ascii="Arial" w:hAnsi="Arial" w:cs="Arial"/>
+                <w:color w:val="C00000"/>
+                <w:sz w:val="20"/>
+                <w:szCs w:val="20"/>
+              </w:rPr>
+              <w:t>yyyy</w:t>
+            </w:r>
+            <w:proofErr w:type="spellEnd"/>
+            <w:r>
+              <w:rPr>
+                <w:rFonts w:ascii="Arial" w:hAnsi="Arial" w:cs="Arial"/>
+                <w:color w:val="C00000"/>
+                <w:sz w:val="20"/>
+                <w:szCs w:val="20"/>
+              </w:rPr>
+              <w:t>/mm/dd&gt;</w:t>
             </w:r>
           </w:p>
         </w:tc>
@@ -2284,6 +2444,7 @@
                 <w:bCs/>
               </w:rPr>
             </w:pPr>
+            <w:bookmarkStart w:id="1" w:name="_Toc243839462"/>
             <w:r>
               <w:rPr>
                 <w:rFonts w:ascii="Arial" w:hAnsi="Arial" w:cs="Arial"/>
@@ -2293,6 +2454,7 @@
               </w:rPr>
               <w:t>Cancel Booking</w:t>
             </w:r>
+            <w:bookmarkEnd w:id="1"/>
           </w:p>
         </w:tc>
       </w:tr>
@@ -2500,7 +2662,27 @@
                 <w:sz w:val="20"/>
                 <w:szCs w:val="20"/>
               </w:rPr>
-              <w:t>&lt;yyyy/mm/dd&gt;</w:t>
+              <w:t>&lt;</w:t>
+            </w:r>
+            <w:proofErr w:type="spellStart"/>
+            <w:r>
+              <w:rPr>
+                <w:rFonts w:ascii="Arial" w:hAnsi="Arial" w:cs="Arial"/>
+                <w:color w:val="C00000"/>
+                <w:sz w:val="20"/>
+                <w:szCs w:val="20"/>
+              </w:rPr>
+              <w:t>yyyy</w:t>
+            </w:r>
+            <w:proofErr w:type="spellEnd"/>
+            <w:r>
+              <w:rPr>
+                <w:rFonts w:ascii="Arial" w:hAnsi="Arial" w:cs="Arial"/>
+                <w:color w:val="C00000"/>
+                <w:sz w:val="20"/>
+                <w:szCs w:val="20"/>
+              </w:rPr>
+              <w:t>/mm/dd&gt;</w:t>
             </w:r>
           </w:p>
         </w:tc>
@@ -3687,7 +3869,27 @@
                 <w:sz w:val="20"/>
                 <w:szCs w:val="20"/>
               </w:rPr>
-              <w:t>User is taken to the view reservations page and the new reservation is not shown</w:t>
+              <w:t xml:space="preserve">User is taken to the view reservations </w:t>
+            </w:r>
+            <w:proofErr w:type="gramStart"/>
+            <w:r>
+              <w:rPr>
+                <w:rFonts w:ascii="Arial" w:hAnsi="Arial" w:cs="Arial"/>
+                <w:color w:val="C00000"/>
+                <w:sz w:val="20"/>
+                <w:szCs w:val="20"/>
+              </w:rPr>
+              <w:t>page</w:t>
+            </w:r>
+            <w:proofErr w:type="gramEnd"/>
+            <w:r>
+              <w:rPr>
+                <w:rFonts w:ascii="Arial" w:hAnsi="Arial" w:cs="Arial"/>
+                <w:color w:val="C00000"/>
+                <w:sz w:val="20"/>
+                <w:szCs w:val="20"/>
+              </w:rPr>
+              <w:t xml:space="preserve"> and the new reservation is not shown</w:t>
             </w:r>
           </w:p>
         </w:tc>
@@ -3865,7 +4067,7 @@
                 <w:bCs/>
               </w:rPr>
             </w:pPr>
-            <w:bookmarkStart w:id="0" w:name="_Toc132718197"/>
+            <w:bookmarkStart w:id="2" w:name="_Toc243839463"/>
             <w:r>
               <w:rPr>
                 <w:rFonts w:ascii="Arial" w:hAnsi="Arial" w:cs="Arial"/>
@@ -3873,9 +4075,9 @@
                 <w:bCs/>
                 <w:color w:val="auto"/>
               </w:rPr>
-              <w:t>&lt;DESCRIPTION&gt;</w:t>
-            </w:r>
-            <w:bookmarkEnd w:id="0"/>
+              <w:t>Access “About Us” Page Directly</w:t>
+            </w:r>
+            <w:bookmarkEnd w:id="2"/>
           </w:p>
         </w:tc>
       </w:tr>
@@ -3906,9 +4108,10 @@
           <w:p>
             <w:pPr>
               <w:rPr>
-                <w:rFonts w:ascii="Arial" w:hAnsi="Arial" w:cs="Arial"/>
-                <w:sz w:val="20"/>
-                <w:szCs w:val="20"/>
+                <w:rFonts w:ascii="Arial" w:hAnsi="Arial" w:cs="Arial" w:hint="eastAsia"/>
+                <w:sz w:val="20"/>
+                <w:szCs w:val="20"/>
+                <w:lang w:eastAsia="ja-JP"/>
               </w:rPr>
             </w:pPr>
             <w:r>
@@ -3931,6 +4134,17 @@
               </w:rPr>
               <w:t xml:space="preserve">: </w:t>
             </w:r>
+            <w:r>
+              <w:rPr>
+                <w:rFonts w:ascii="Arial" w:hAnsi="Arial" w:cs="Arial" w:hint="eastAsia"/>
+                <w:b/>
+                <w:bCs/>
+                <w:sz w:val="20"/>
+                <w:szCs w:val="20"/>
+                <w:lang w:eastAsia="ja-JP"/>
+              </w:rPr>
+              <w:t>Verify About Us page can be accessed directly</w:t>
+            </w:r>
           </w:p>
         </w:tc>
         <w:tc>
@@ -3957,6 +4171,16 @@
               </w:rPr>
               <w:t>Developer:</w:t>
             </w:r>
+            <w:r>
+              <w:rPr>
+                <w:rFonts w:ascii="Arial" w:hAnsi="Arial" w:cs="Arial"/>
+                <w:b/>
+                <w:bCs/>
+                <w:sz w:val="20"/>
+                <w:szCs w:val="20"/>
+              </w:rPr>
+              <w:t xml:space="preserve"> Daniel Preller</w:t>
+            </w:r>
           </w:p>
           <w:p>
             <w:pPr>
@@ -3991,7 +4215,16 @@
                 <w:sz w:val="20"/>
                 <w:szCs w:val="20"/>
               </w:rPr>
-              <w:t xml:space="preserve">&lt;yyyy/mm/dd&gt; </w:t>
+              <w:t>2026/10/25</w:t>
+            </w:r>
+            <w:r>
+              <w:rPr>
+                <w:rFonts w:ascii="Arial" w:hAnsi="Arial" w:cs="Arial"/>
+                <w:color w:val="C00000"/>
+                <w:sz w:val="20"/>
+                <w:szCs w:val="20"/>
+              </w:rPr>
+              <w:t xml:space="preserve"> </w:t>
             </w:r>
           </w:p>
         </w:tc>
@@ -4054,7 +4287,27 @@
                 <w:sz w:val="20"/>
                 <w:szCs w:val="20"/>
               </w:rPr>
-              <w:t>&lt;yyyy/mm/dd&gt;</w:t>
+              <w:t>&lt;</w:t>
+            </w:r>
+            <w:proofErr w:type="spellStart"/>
+            <w:r>
+              <w:rPr>
+                <w:rFonts w:ascii="Arial" w:hAnsi="Arial" w:cs="Arial"/>
+                <w:color w:val="C00000"/>
+                <w:sz w:val="20"/>
+                <w:szCs w:val="20"/>
+              </w:rPr>
+              <w:t>yyyy</w:t>
+            </w:r>
+            <w:proofErr w:type="spellEnd"/>
+            <w:r>
+              <w:rPr>
+                <w:rFonts w:ascii="Arial" w:hAnsi="Arial" w:cs="Arial"/>
+                <w:color w:val="C00000"/>
+                <w:sz w:val="20"/>
+                <w:szCs w:val="20"/>
+              </w:rPr>
+              <w:t>/mm/dd&gt;</w:t>
             </w:r>
           </w:p>
         </w:tc>
@@ -4234,20 +4487,95 @@
             <w:pPr>
               <w:spacing w:before="80" w:after="80"/>
               <w:rPr>
-                <w:rFonts w:ascii="Arial" w:hAnsi="Arial" w:cs="Arial"/>
-                <w:color w:val="C00000"/>
-                <w:sz w:val="20"/>
-                <w:szCs w:val="20"/>
-              </w:rPr>
-            </w:pPr>
-            <w:r>
-              <w:rPr>
-                <w:rFonts w:ascii="Arial" w:hAnsi="Arial" w:cs="Arial"/>
-                <w:color w:val="C00000"/>
-                <w:sz w:val="20"/>
-                <w:szCs w:val="20"/>
-              </w:rPr>
-              <w:t>&lt;Enter an action&gt;</w:t>
+                <w:rFonts w:ascii="Arial" w:hAnsi="Arial" w:cs="Arial" w:hint="eastAsia"/>
+                <w:color w:val="C00000"/>
+                <w:sz w:val="20"/>
+                <w:szCs w:val="20"/>
+                <w:lang w:eastAsia="ja-JP"/>
+              </w:rPr>
+            </w:pPr>
+            <w:r>
+              <w:rPr>
+                <w:rFonts w:ascii="Arial" w:hAnsi="Arial" w:cs="Arial"/>
+                <w:color w:val="C00000"/>
+                <w:sz w:val="20"/>
+                <w:szCs w:val="20"/>
+              </w:rPr>
+              <w:t xml:space="preserve">Go to </w:t>
+            </w:r>
+            <w:proofErr w:type="gramStart"/>
+            <w:r>
+              <w:rPr>
+                <w:rFonts w:ascii="Arial" w:hAnsi="Arial" w:cs="Arial"/>
+                <w:color w:val="C00000"/>
+                <w:sz w:val="20"/>
+                <w:szCs w:val="20"/>
+              </w:rPr>
+              <w:t>about</w:t>
+            </w:r>
+            <w:proofErr w:type="gramEnd"/>
+            <w:r>
+              <w:rPr>
+                <w:rFonts w:ascii="Arial" w:hAnsi="Arial" w:cs="Arial"/>
+                <w:color w:val="C00000"/>
+                <w:sz w:val="20"/>
+                <w:szCs w:val="20"/>
+              </w:rPr>
+              <w:t xml:space="preserve"> page (</w:t>
+            </w:r>
+            <w:r>
+              <w:rPr>
+                <w:rFonts w:ascii="Arial" w:hAnsi="Arial" w:cs="Arial" w:hint="eastAsia"/>
+                <w:color w:val="C00000"/>
+                <w:sz w:val="20"/>
+                <w:szCs w:val="20"/>
+                <w:lang w:eastAsia="ja-JP"/>
+              </w:rPr>
+              <w:t>&lt;user-specific localhost URL&gt;/</w:t>
+            </w:r>
+            <w:proofErr w:type="spellStart"/>
+            <w:r>
+              <w:rPr>
+                <w:rFonts w:ascii="Arial" w:hAnsi="Arial" w:cs="Arial" w:hint="eastAsia"/>
+                <w:color w:val="C00000"/>
+                <w:sz w:val="20"/>
+                <w:szCs w:val="20"/>
+                <w:lang w:eastAsia="ja-JP"/>
+              </w:rPr>
+              <w:t>MoffatBay</w:t>
+            </w:r>
+            <w:proofErr w:type="spellEnd"/>
+            <w:r>
+              <w:rPr>
+                <w:rFonts w:ascii="Arial" w:hAnsi="Arial" w:cs="Arial" w:hint="eastAsia"/>
+                <w:color w:val="C00000"/>
+                <w:sz w:val="20"/>
+                <w:szCs w:val="20"/>
+                <w:lang w:eastAsia="ja-JP"/>
+              </w:rPr>
+              <w:t>/</w:t>
+            </w:r>
+            <w:proofErr w:type="spellStart"/>
+            <w:r>
+              <w:rPr>
+                <w:rFonts w:ascii="Arial" w:hAnsi="Arial" w:cs="Arial" w:hint="eastAsia"/>
+                <w:color w:val="C00000"/>
+                <w:sz w:val="20"/>
+                <w:szCs w:val="20"/>
+                <w:lang w:eastAsia="ja-JP"/>
+              </w:rPr>
+              <w:t>about.jsp</w:t>
+            </w:r>
+            <w:proofErr w:type="spellEnd"/>
+            <w:r>
+              <w:rPr>
+                <w:rFonts w:ascii="Arial" w:hAnsi="Arial" w:cs="Arial" w:hint="eastAsia"/>
+                <w:color w:val="C00000"/>
+                <w:sz w:val="20"/>
+                <w:szCs w:val="20"/>
+                <w:lang w:eastAsia="ja-JP"/>
+              </w:rPr>
+              <w:t>)</w:t>
             </w:r>
           </w:p>
         </w:tc>
@@ -4259,20 +4587,22 @@
             <w:pPr>
               <w:spacing w:before="80" w:after="80"/>
               <w:rPr>
-                <w:rFonts w:ascii="Arial" w:hAnsi="Arial" w:cs="Arial"/>
-                <w:color w:val="C00000"/>
-                <w:sz w:val="20"/>
-                <w:szCs w:val="20"/>
-              </w:rPr>
-            </w:pPr>
-            <w:r>
-              <w:rPr>
-                <w:rFonts w:ascii="Arial" w:hAnsi="Arial" w:cs="Arial"/>
-                <w:color w:val="C00000"/>
-                <w:sz w:val="20"/>
-                <w:szCs w:val="20"/>
-              </w:rPr>
-              <w:t>&lt;Enter the expected results&gt;</w:t>
+                <w:rFonts w:ascii="Arial" w:hAnsi="Arial" w:cs="Arial" w:hint="eastAsia"/>
+                <w:color w:val="C00000"/>
+                <w:sz w:val="20"/>
+                <w:szCs w:val="20"/>
+                <w:lang w:eastAsia="ja-JP"/>
+              </w:rPr>
+            </w:pPr>
+            <w:r>
+              <w:rPr>
+                <w:rFonts w:ascii="Arial" w:hAnsi="Arial" w:cs="Arial" w:hint="eastAsia"/>
+                <w:color w:val="C00000"/>
+                <w:sz w:val="20"/>
+                <w:szCs w:val="20"/>
+                <w:lang w:eastAsia="ja-JP"/>
+              </w:rPr>
+              <w:t>About Us page loads</w:t>
             </w:r>
           </w:p>
         </w:tc>
@@ -4284,20 +4614,22 @@
             <w:pPr>
               <w:spacing w:before="80" w:after="80"/>
               <w:rPr>
-                <w:rFonts w:ascii="Arial" w:hAnsi="Arial" w:cs="Arial"/>
-                <w:color w:val="C00000"/>
-                <w:sz w:val="20"/>
-                <w:szCs w:val="20"/>
-              </w:rPr>
-            </w:pPr>
-            <w:r>
-              <w:rPr>
-                <w:rFonts w:ascii="Arial" w:hAnsi="Arial" w:cs="Arial"/>
-                <w:color w:val="C00000"/>
-                <w:sz w:val="20"/>
-                <w:szCs w:val="20"/>
-              </w:rPr>
-              <w:t>&lt;yes/no&gt;</w:t>
+                <w:rFonts w:ascii="Arial" w:hAnsi="Arial" w:cs="Arial" w:hint="eastAsia"/>
+                <w:color w:val="C00000"/>
+                <w:sz w:val="20"/>
+                <w:szCs w:val="20"/>
+                <w:lang w:eastAsia="ja-JP"/>
+              </w:rPr>
+            </w:pPr>
+            <w:r>
+              <w:rPr>
+                <w:rFonts w:ascii="Arial" w:hAnsi="Arial" w:cs="Arial" w:hint="eastAsia"/>
+                <w:color w:val="C00000"/>
+                <w:sz w:val="20"/>
+                <w:szCs w:val="20"/>
+                <w:lang w:eastAsia="ja-JP"/>
+              </w:rPr>
+              <w:t>yes</w:t>
             </w:r>
           </w:p>
         </w:tc>
@@ -4362,20 +4694,32 @@
             <w:pPr>
               <w:spacing w:before="80" w:after="80"/>
               <w:rPr>
-                <w:rFonts w:ascii="Arial" w:hAnsi="Arial" w:cs="Arial"/>
-                <w:color w:val="C00000"/>
-                <w:sz w:val="20"/>
-                <w:szCs w:val="20"/>
-              </w:rPr>
-            </w:pPr>
-            <w:r>
-              <w:rPr>
-                <w:rFonts w:ascii="Arial" w:hAnsi="Arial" w:cs="Arial"/>
-                <w:color w:val="C00000"/>
-                <w:sz w:val="20"/>
-                <w:szCs w:val="20"/>
-              </w:rPr>
-              <w:t>&lt;Enter an action&gt;</w:t>
+                <w:rFonts w:ascii="Arial" w:hAnsi="Arial" w:cs="Arial" w:hint="eastAsia"/>
+                <w:color w:val="C00000"/>
+                <w:sz w:val="20"/>
+                <w:szCs w:val="20"/>
+                <w:lang w:eastAsia="ja-JP"/>
+              </w:rPr>
+            </w:pPr>
+            <w:r>
+              <w:rPr>
+                <w:rFonts w:ascii="Arial" w:hAnsi="Arial" w:cs="Arial"/>
+                <w:color w:val="C00000"/>
+                <w:sz w:val="20"/>
+                <w:szCs w:val="20"/>
+                <w:lang w:eastAsia="ja-JP"/>
+              </w:rPr>
+              <w:t>C</w:t>
+            </w:r>
+            <w:r>
+              <w:rPr>
+                <w:rFonts w:ascii="Arial" w:hAnsi="Arial" w:cs="Arial" w:hint="eastAsia"/>
+                <w:color w:val="C00000"/>
+                <w:sz w:val="20"/>
+                <w:szCs w:val="20"/>
+                <w:lang w:eastAsia="ja-JP"/>
+              </w:rPr>
+              <w:t>onfirm About Us page content is present</w:t>
             </w:r>
           </w:p>
         </w:tc>
@@ -4387,20 +4731,22 @@
             <w:pPr>
               <w:spacing w:before="80" w:after="80"/>
               <w:rPr>
-                <w:rFonts w:ascii="Arial" w:hAnsi="Arial" w:cs="Arial"/>
-                <w:color w:val="C00000"/>
-                <w:sz w:val="20"/>
-                <w:szCs w:val="20"/>
-              </w:rPr>
-            </w:pPr>
-            <w:r>
-              <w:rPr>
-                <w:rFonts w:ascii="Arial" w:hAnsi="Arial" w:cs="Arial"/>
-                <w:color w:val="C00000"/>
-                <w:sz w:val="20"/>
-                <w:szCs w:val="20"/>
-              </w:rPr>
-              <w:t>&lt;Enter the expected results&gt;</w:t>
+                <w:rFonts w:ascii="Arial" w:hAnsi="Arial" w:cs="Arial" w:hint="eastAsia"/>
+                <w:color w:val="C00000"/>
+                <w:sz w:val="20"/>
+                <w:szCs w:val="20"/>
+                <w:lang w:eastAsia="ja-JP"/>
+              </w:rPr>
+            </w:pPr>
+            <w:r>
+              <w:rPr>
+                <w:rFonts w:ascii="Arial" w:hAnsi="Arial" w:cs="Arial" w:hint="eastAsia"/>
+                <w:color w:val="C00000"/>
+                <w:sz w:val="20"/>
+                <w:szCs w:val="20"/>
+                <w:lang w:eastAsia="ja-JP"/>
+              </w:rPr>
+              <w:t>Page contents load (Hero image, Out Lodge section, Our Story section, images for Our Staff, Our Home, and Our Backyard)</w:t>
             </w:r>
           </w:p>
         </w:tc>
@@ -4412,404 +4758,22 @@
             <w:pPr>
               <w:spacing w:before="80" w:after="80"/>
               <w:rPr>
-                <w:rFonts w:ascii="Arial" w:hAnsi="Arial" w:cs="Arial"/>
-                <w:color w:val="C00000"/>
-                <w:sz w:val="20"/>
-                <w:szCs w:val="20"/>
-              </w:rPr>
-            </w:pPr>
-            <w:r>
-              <w:rPr>
-                <w:rFonts w:ascii="Arial" w:hAnsi="Arial" w:cs="Arial"/>
-                <w:color w:val="C00000"/>
-                <w:sz w:val="20"/>
-                <w:szCs w:val="20"/>
-              </w:rPr>
-              <w:t>&lt;yes/no&gt;</w:t>
-            </w:r>
-          </w:p>
-        </w:tc>
-        <w:tc>
-          <w:tcPr>
-            <w:tcW w:w="2052" w:type="dxa"/>
-          </w:tcPr>
-          <w:p>
-            <w:pPr>
-              <w:spacing w:before="80" w:after="80"/>
-              <w:rPr>
-                <w:rFonts w:ascii="Arial" w:hAnsi="Arial" w:cs="Arial"/>
-                <w:color w:val="C00000"/>
-                <w:sz w:val="20"/>
-                <w:szCs w:val="20"/>
-              </w:rPr>
-            </w:pPr>
-            <w:r>
-              <w:rPr>
-                <w:rFonts w:ascii="Arial" w:hAnsi="Arial" w:cs="Arial"/>
-                <w:color w:val="C00000"/>
-                <w:sz w:val="20"/>
-                <w:szCs w:val="20"/>
-              </w:rPr>
-              <w:t>&lt;yes/no&gt;</w:t>
-            </w:r>
-          </w:p>
-        </w:tc>
-      </w:tr>
-      <w:tr>
-        <w:trPr>
-          <w:trHeight w:val="350"/>
-        </w:trPr>
-        <w:tc>
-          <w:tcPr>
-            <w:tcW w:w="1250" w:type="dxa"/>
-          </w:tcPr>
-          <w:p>
-            <w:pPr>
-              <w:spacing w:before="80" w:after="80"/>
-              <w:rPr>
-                <w:rFonts w:ascii="Arial" w:hAnsi="Arial" w:cs="Arial"/>
-                <w:sz w:val="20"/>
-                <w:szCs w:val="20"/>
-              </w:rPr>
-            </w:pPr>
-            <w:r>
-              <w:rPr>
-                <w:rFonts w:ascii="Arial" w:hAnsi="Arial" w:cs="Arial"/>
-                <w:sz w:val="20"/>
-                <w:szCs w:val="20"/>
-              </w:rPr>
-              <w:t>3</w:t>
-            </w:r>
-          </w:p>
-        </w:tc>
-        <w:tc>
-          <w:tcPr>
-            <w:tcW w:w="3570" w:type="dxa"/>
-          </w:tcPr>
-          <w:p>
-            <w:pPr>
-              <w:spacing w:before="80" w:after="80"/>
-              <w:rPr>
-                <w:rFonts w:ascii="Arial" w:hAnsi="Arial" w:cs="Arial"/>
-                <w:color w:val="C00000"/>
-                <w:sz w:val="20"/>
-                <w:szCs w:val="20"/>
-              </w:rPr>
-            </w:pPr>
-            <w:r>
-              <w:rPr>
-                <w:rFonts w:ascii="Arial" w:hAnsi="Arial" w:cs="Arial"/>
-                <w:color w:val="C00000"/>
-                <w:sz w:val="20"/>
-                <w:szCs w:val="20"/>
-              </w:rPr>
-              <w:t>&lt;Enter an action&gt;</w:t>
-            </w:r>
-          </w:p>
-        </w:tc>
-        <w:tc>
-          <w:tcPr>
-            <w:tcW w:w="3930" w:type="dxa"/>
-          </w:tcPr>
-          <w:p>
-            <w:pPr>
-              <w:spacing w:before="80" w:after="80"/>
-              <w:rPr>
-                <w:rFonts w:ascii="Arial" w:hAnsi="Arial" w:cs="Arial"/>
-                <w:color w:val="C00000"/>
-                <w:sz w:val="20"/>
-                <w:szCs w:val="20"/>
-              </w:rPr>
-            </w:pPr>
-            <w:r>
-              <w:rPr>
-                <w:rFonts w:ascii="Arial" w:hAnsi="Arial" w:cs="Arial"/>
-                <w:color w:val="C00000"/>
-                <w:sz w:val="20"/>
-                <w:szCs w:val="20"/>
-              </w:rPr>
-              <w:t>&lt;Enter the expected results&gt;</w:t>
-            </w:r>
-          </w:p>
-        </w:tc>
-        <w:tc>
-          <w:tcPr>
-            <w:tcW w:w="2148" w:type="dxa"/>
-          </w:tcPr>
-          <w:p>
-            <w:pPr>
-              <w:spacing w:before="80" w:after="80"/>
-              <w:rPr>
-                <w:rFonts w:ascii="Arial" w:hAnsi="Arial" w:cs="Arial"/>
-                <w:color w:val="C00000"/>
-                <w:sz w:val="20"/>
-                <w:szCs w:val="20"/>
-              </w:rPr>
-            </w:pPr>
-            <w:r>
-              <w:rPr>
-                <w:rFonts w:ascii="Arial" w:hAnsi="Arial" w:cs="Arial"/>
-                <w:color w:val="C00000"/>
-                <w:sz w:val="20"/>
-                <w:szCs w:val="20"/>
-              </w:rPr>
-              <w:t>&lt;yes/no&gt;</w:t>
-            </w:r>
-          </w:p>
-        </w:tc>
-        <w:tc>
-          <w:tcPr>
-            <w:tcW w:w="2052" w:type="dxa"/>
-          </w:tcPr>
-          <w:p>
-            <w:pPr>
-              <w:spacing w:before="80" w:after="80"/>
-              <w:rPr>
-                <w:rFonts w:ascii="Arial" w:hAnsi="Arial" w:cs="Arial"/>
-                <w:color w:val="C00000"/>
-                <w:sz w:val="20"/>
-                <w:szCs w:val="20"/>
-              </w:rPr>
-            </w:pPr>
-            <w:r>
-              <w:rPr>
-                <w:rFonts w:ascii="Arial" w:hAnsi="Arial" w:cs="Arial"/>
-                <w:color w:val="C00000"/>
-                <w:sz w:val="20"/>
-                <w:szCs w:val="20"/>
-              </w:rPr>
-              <w:t>&lt;yes/no&gt;</w:t>
-            </w:r>
-          </w:p>
-        </w:tc>
-      </w:tr>
-      <w:tr>
-        <w:trPr>
-          <w:trHeight w:val="350"/>
-        </w:trPr>
-        <w:tc>
-          <w:tcPr>
-            <w:tcW w:w="1250" w:type="dxa"/>
-          </w:tcPr>
-          <w:p>
-            <w:pPr>
-              <w:spacing w:before="80" w:after="80"/>
-              <w:rPr>
-                <w:rFonts w:ascii="Arial" w:hAnsi="Arial" w:cs="Arial"/>
-                <w:sz w:val="20"/>
-                <w:szCs w:val="20"/>
-              </w:rPr>
-            </w:pPr>
-            <w:r>
-              <w:rPr>
-                <w:rFonts w:ascii="Arial" w:hAnsi="Arial" w:cs="Arial"/>
-                <w:sz w:val="20"/>
-                <w:szCs w:val="20"/>
-              </w:rPr>
-              <w:t>4</w:t>
-            </w:r>
-          </w:p>
-        </w:tc>
-        <w:tc>
-          <w:tcPr>
-            <w:tcW w:w="3570" w:type="dxa"/>
-          </w:tcPr>
-          <w:p>
-            <w:pPr>
-              <w:spacing w:before="80" w:after="80"/>
-              <w:rPr>
-                <w:rFonts w:ascii="Arial" w:hAnsi="Arial" w:cs="Arial"/>
-                <w:color w:val="C00000"/>
-                <w:sz w:val="20"/>
-                <w:szCs w:val="20"/>
-              </w:rPr>
-            </w:pPr>
-            <w:r>
-              <w:rPr>
-                <w:rFonts w:ascii="Arial" w:hAnsi="Arial" w:cs="Arial"/>
-                <w:color w:val="C00000"/>
-                <w:sz w:val="20"/>
-                <w:szCs w:val="20"/>
-              </w:rPr>
-              <w:t>&lt;Enter an action&gt;</w:t>
-            </w:r>
-          </w:p>
-        </w:tc>
-        <w:tc>
-          <w:tcPr>
-            <w:tcW w:w="3930" w:type="dxa"/>
-          </w:tcPr>
-          <w:p>
-            <w:pPr>
-              <w:spacing w:before="80" w:after="80"/>
-              <w:rPr>
-                <w:rFonts w:ascii="Arial" w:hAnsi="Arial" w:cs="Arial"/>
-                <w:color w:val="C00000"/>
-                <w:sz w:val="20"/>
-                <w:szCs w:val="20"/>
-              </w:rPr>
-            </w:pPr>
-            <w:r>
-              <w:rPr>
-                <w:rFonts w:ascii="Arial" w:hAnsi="Arial" w:cs="Arial"/>
-                <w:color w:val="C00000"/>
-                <w:sz w:val="20"/>
-                <w:szCs w:val="20"/>
-              </w:rPr>
-              <w:t>&lt;Enter the expected results&gt;</w:t>
-            </w:r>
-          </w:p>
-        </w:tc>
-        <w:tc>
-          <w:tcPr>
-            <w:tcW w:w="2148" w:type="dxa"/>
-          </w:tcPr>
-          <w:p>
-            <w:pPr>
-              <w:spacing w:before="80" w:after="80"/>
-              <w:rPr>
-                <w:rFonts w:ascii="Arial" w:hAnsi="Arial" w:cs="Arial"/>
-                <w:color w:val="C00000"/>
-                <w:sz w:val="20"/>
-                <w:szCs w:val="20"/>
-              </w:rPr>
-            </w:pPr>
-            <w:r>
-              <w:rPr>
-                <w:rFonts w:ascii="Arial" w:hAnsi="Arial" w:cs="Arial"/>
-                <w:color w:val="C00000"/>
-                <w:sz w:val="20"/>
-                <w:szCs w:val="20"/>
-              </w:rPr>
-              <w:t>&lt;yes/no&gt;</w:t>
-            </w:r>
-          </w:p>
-        </w:tc>
-        <w:tc>
-          <w:tcPr>
-            <w:tcW w:w="2052" w:type="dxa"/>
-          </w:tcPr>
-          <w:p>
-            <w:pPr>
-              <w:spacing w:before="80" w:after="80"/>
-              <w:rPr>
-                <w:rFonts w:ascii="Arial" w:hAnsi="Arial" w:cs="Arial"/>
-                <w:color w:val="C00000"/>
-                <w:sz w:val="20"/>
-                <w:szCs w:val="20"/>
-              </w:rPr>
-            </w:pPr>
-            <w:r>
-              <w:rPr>
-                <w:rFonts w:ascii="Arial" w:hAnsi="Arial" w:cs="Arial"/>
-                <w:color w:val="C00000"/>
-                <w:sz w:val="20"/>
-                <w:szCs w:val="20"/>
-              </w:rPr>
-              <w:t>&lt;yes/no&gt;</w:t>
-            </w:r>
-          </w:p>
-        </w:tc>
-      </w:tr>
-      <w:tr>
-        <w:trPr>
-          <w:trHeight w:val="350"/>
-        </w:trPr>
-        <w:tc>
-          <w:tcPr>
-            <w:tcW w:w="1250" w:type="dxa"/>
-          </w:tcPr>
-          <w:p>
-            <w:pPr>
-              <w:spacing w:before="80" w:after="80"/>
-              <w:rPr>
-                <w:rFonts w:ascii="Arial" w:hAnsi="Arial" w:cs="Arial"/>
-                <w:sz w:val="20"/>
-                <w:szCs w:val="20"/>
-              </w:rPr>
-            </w:pPr>
-            <w:r>
-              <w:rPr>
-                <w:rFonts w:ascii="Arial" w:hAnsi="Arial" w:cs="Arial"/>
-                <w:sz w:val="20"/>
-                <w:szCs w:val="20"/>
-              </w:rPr>
-              <w:t>5</w:t>
-            </w:r>
-          </w:p>
-        </w:tc>
-        <w:tc>
-          <w:tcPr>
-            <w:tcW w:w="3570" w:type="dxa"/>
-          </w:tcPr>
-          <w:p>
-            <w:pPr>
-              <w:spacing w:before="80" w:after="80"/>
-              <w:rPr>
-                <w:rFonts w:ascii="Arial" w:hAnsi="Arial" w:cs="Arial"/>
-                <w:color w:val="C00000"/>
-                <w:sz w:val="20"/>
-                <w:szCs w:val="20"/>
-              </w:rPr>
-            </w:pPr>
-            <w:r>
-              <w:rPr>
-                <w:rFonts w:ascii="Arial" w:hAnsi="Arial" w:cs="Arial"/>
-                <w:color w:val="C00000"/>
-                <w:sz w:val="20"/>
-                <w:szCs w:val="20"/>
-              </w:rPr>
-              <w:t>&lt;Enter an action&gt;</w:t>
-            </w:r>
-          </w:p>
-        </w:tc>
-        <w:tc>
-          <w:tcPr>
-            <w:tcW w:w="3930" w:type="dxa"/>
-          </w:tcPr>
-          <w:p>
-            <w:pPr>
-              <w:spacing w:before="80" w:after="80"/>
-              <w:rPr>
-                <w:rFonts w:ascii="Arial" w:hAnsi="Arial" w:cs="Arial"/>
-                <w:color w:val="C00000"/>
-                <w:sz w:val="20"/>
-                <w:szCs w:val="20"/>
-              </w:rPr>
-            </w:pPr>
-            <w:r>
-              <w:rPr>
-                <w:rFonts w:ascii="Arial" w:hAnsi="Arial" w:cs="Arial"/>
-                <w:color w:val="C00000"/>
-                <w:sz w:val="20"/>
-                <w:szCs w:val="20"/>
-              </w:rPr>
-              <w:t>&lt;Enter the expected results&gt;</w:t>
-            </w:r>
-          </w:p>
-        </w:tc>
-        <w:tc>
-          <w:tcPr>
-            <w:tcW w:w="2148" w:type="dxa"/>
-          </w:tcPr>
-          <w:p>
-            <w:pPr>
-              <w:spacing w:before="80" w:after="80"/>
-              <w:rPr>
-                <w:rFonts w:ascii="Arial" w:hAnsi="Arial" w:cs="Arial"/>
-                <w:color w:val="C00000"/>
-                <w:sz w:val="20"/>
-                <w:szCs w:val="20"/>
-              </w:rPr>
-            </w:pPr>
-            <w:r>
-              <w:rPr>
-                <w:rFonts w:ascii="Arial" w:hAnsi="Arial" w:cs="Arial"/>
-                <w:color w:val="C00000"/>
-                <w:sz w:val="20"/>
-                <w:szCs w:val="20"/>
-              </w:rPr>
-              <w:t>&lt;yes/no&gt;</w:t>
+                <w:rFonts w:ascii="Arial" w:hAnsi="Arial" w:cs="Arial" w:hint="eastAsia"/>
+                <w:color w:val="C00000"/>
+                <w:sz w:val="20"/>
+                <w:szCs w:val="20"/>
+                <w:lang w:eastAsia="ja-JP"/>
+              </w:rPr>
+            </w:pPr>
+            <w:r>
+              <w:rPr>
+                <w:rFonts w:ascii="Arial" w:hAnsi="Arial" w:cs="Arial" w:hint="eastAsia"/>
+                <w:color w:val="C00000"/>
+                <w:sz w:val="20"/>
+                <w:szCs w:val="20"/>
+                <w:lang w:eastAsia="ja-JP"/>
+              </w:rPr>
+              <w:t>yes</w:t>
             </w:r>
           </w:p>
         </w:tc>
@@ -4945,15 +4909,7 @@
                 <w:sz w:val="24"/>
                 <w:szCs w:val="24"/>
               </w:rPr>
-              <w:t xml:space="preserve">Test </w:t>
-            </w:r>
-            <w:r>
-              <w:rPr>
-                <w:rFonts w:ascii="Arial" w:hAnsi="Arial" w:cs="Arial"/>
-                <w:sz w:val="24"/>
-                <w:szCs w:val="24"/>
-              </w:rPr>
-              <w:t>4</w:t>
+              <w:t>Test 4</w:t>
             </w:r>
           </w:p>
         </w:tc>
@@ -4971,6 +4927,7 @@
                 <w:bCs/>
               </w:rPr>
             </w:pPr>
+            <w:bookmarkStart w:id="3" w:name="_Toc243839464"/>
             <w:r>
               <w:rPr>
                 <w:rFonts w:ascii="Arial" w:hAnsi="Arial" w:cs="Arial"/>
@@ -4978,8 +4935,28 @@
                 <w:bCs/>
                 <w:color w:val="auto"/>
               </w:rPr>
-              <w:t>&lt;DESCRIPTION&gt;</w:t>
-            </w:r>
+              <w:t>Access “About Us” Page from Home</w:t>
+            </w:r>
+            <w:r>
+              <w:rPr>
+                <w:rFonts w:ascii="Arial" w:hAnsi="Arial" w:cs="Arial" w:hint="eastAsia"/>
+                <w:b/>
+                <w:bCs/>
+                <w:color w:val="auto"/>
+                <w:lang w:eastAsia="ja-JP"/>
+              </w:rPr>
+              <w:t xml:space="preserve"> P</w:t>
+            </w:r>
+            <w:r>
+              <w:rPr>
+                <w:rFonts w:ascii="Arial" w:hAnsi="Arial" w:cs="Arial"/>
+                <w:b/>
+                <w:bCs/>
+                <w:color w:val="auto"/>
+              </w:rPr>
+              <w:t>age</w:t>
+            </w:r>
+            <w:bookmarkEnd w:id="3"/>
           </w:p>
         </w:tc>
       </w:tr>
@@ -5010,9 +4987,10 @@
           <w:p>
             <w:pPr>
               <w:rPr>
-                <w:rFonts w:ascii="Arial" w:hAnsi="Arial" w:cs="Arial"/>
-                <w:sz w:val="20"/>
-                <w:szCs w:val="20"/>
+                <w:rFonts w:ascii="Arial" w:hAnsi="Arial" w:cs="Arial" w:hint="eastAsia"/>
+                <w:sz w:val="20"/>
+                <w:szCs w:val="20"/>
+                <w:lang w:eastAsia="ja-JP"/>
               </w:rPr>
             </w:pPr>
             <w:r>
@@ -5035,6 +5013,17 @@
               </w:rPr>
               <w:t xml:space="preserve">: </w:t>
             </w:r>
+            <w:r>
+              <w:rPr>
+                <w:rFonts w:ascii="Arial" w:hAnsi="Arial" w:cs="Arial" w:hint="eastAsia"/>
+                <w:b/>
+                <w:bCs/>
+                <w:sz w:val="20"/>
+                <w:szCs w:val="20"/>
+                <w:lang w:eastAsia="ja-JP"/>
+              </w:rPr>
+              <w:t>Verify About Us page can be accessed through the navigation bar</w:t>
+            </w:r>
           </w:p>
         </w:tc>
         <w:tc>
@@ -5044,11 +5033,12 @@
           <w:p>
             <w:pPr>
               <w:rPr>
-                <w:rFonts w:ascii="Arial" w:hAnsi="Arial" w:cs="Arial"/>
-                <w:b/>
-                <w:bCs/>
-                <w:sz w:val="20"/>
-                <w:szCs w:val="20"/>
+                <w:rFonts w:ascii="Arial" w:hAnsi="Arial" w:cs="Arial" w:hint="eastAsia"/>
+                <w:b/>
+                <w:bCs/>
+                <w:sz w:val="20"/>
+                <w:szCs w:val="20"/>
+                <w:lang w:eastAsia="ja-JP"/>
               </w:rPr>
             </w:pPr>
             <w:r>
@@ -5061,13 +5051,25 @@
               </w:rPr>
               <w:t>Developer:</w:t>
             </w:r>
-          </w:p>
-          <w:p>
-            <w:pPr>
-              <w:rPr>
-                <w:rFonts w:ascii="Arial" w:hAnsi="Arial" w:cs="Arial"/>
-                <w:sz w:val="20"/>
-                <w:szCs w:val="20"/>
+            <w:r>
+              <w:rPr>
+                <w:rFonts w:ascii="Arial" w:hAnsi="Arial" w:cs="Arial" w:hint="eastAsia"/>
+                <w:b/>
+                <w:bCs/>
+                <w:sz w:val="20"/>
+                <w:szCs w:val="20"/>
+                <w:lang w:eastAsia="ja-JP"/>
+              </w:rPr>
+              <w:t xml:space="preserve"> Daniel Preller</w:t>
+            </w:r>
+          </w:p>
+          <w:p>
+            <w:pPr>
+              <w:rPr>
+                <w:rFonts w:ascii="Arial" w:hAnsi="Arial" w:cs="Arial" w:hint="eastAsia"/>
+                <w:sz w:val="20"/>
+                <w:szCs w:val="20"/>
+                <w:lang w:eastAsia="ja-JP"/>
               </w:rPr>
             </w:pPr>
             <w:r>
@@ -5090,12 +5092,13 @@
             </w:r>
             <w:r>
               <w:rPr>
-                <w:rFonts w:ascii="Arial" w:hAnsi="Arial" w:cs="Arial"/>
-                <w:color w:val="C00000"/>
-                <w:sz w:val="20"/>
-                <w:szCs w:val="20"/>
-              </w:rPr>
-              <w:t xml:space="preserve">&lt;yyyy/mm/dd&gt; </w:t>
+                <w:rFonts w:ascii="Arial" w:hAnsi="Arial" w:cs="Arial" w:hint="eastAsia"/>
+                <w:color w:val="C00000"/>
+                <w:sz w:val="20"/>
+                <w:szCs w:val="20"/>
+                <w:lang w:eastAsia="ja-JP"/>
+              </w:rPr>
+              <w:t>2026/10/25</w:t>
             </w:r>
           </w:p>
         </w:tc>
@@ -5158,7 +5161,27 @@
                 <w:sz w:val="20"/>
                 <w:szCs w:val="20"/>
               </w:rPr>
-              <w:t>&lt;yyyy/mm/dd&gt;</w:t>
+              <w:t>&lt;</w:t>
+            </w:r>
+            <w:proofErr w:type="spellStart"/>
+            <w:r>
+              <w:rPr>
+                <w:rFonts w:ascii="Arial" w:hAnsi="Arial" w:cs="Arial"/>
+                <w:color w:val="C00000"/>
+                <w:sz w:val="20"/>
+                <w:szCs w:val="20"/>
+              </w:rPr>
+              <w:t>yyyy</w:t>
+            </w:r>
+            <w:proofErr w:type="spellEnd"/>
+            <w:r>
+              <w:rPr>
+                <w:rFonts w:ascii="Arial" w:hAnsi="Arial" w:cs="Arial"/>
+                <w:color w:val="C00000"/>
+                <w:sz w:val="20"/>
+                <w:szCs w:val="20"/>
+              </w:rPr>
+              <w:t>/mm/dd&gt;</w:t>
             </w:r>
           </w:p>
         </w:tc>
@@ -5338,20 +5361,76 @@
             <w:pPr>
               <w:spacing w:before="80" w:after="80"/>
               <w:rPr>
-                <w:rFonts w:ascii="Arial" w:hAnsi="Arial" w:cs="Arial"/>
-                <w:color w:val="C00000"/>
-                <w:sz w:val="20"/>
-                <w:szCs w:val="20"/>
-              </w:rPr>
-            </w:pPr>
-            <w:r>
-              <w:rPr>
-                <w:rFonts w:ascii="Arial" w:hAnsi="Arial" w:cs="Arial"/>
-                <w:color w:val="C00000"/>
-                <w:sz w:val="20"/>
-                <w:szCs w:val="20"/>
-              </w:rPr>
-              <w:t>&lt;Enter an action&gt;</w:t>
+                <w:rFonts w:ascii="Arial" w:hAnsi="Arial" w:cs="Arial" w:hint="eastAsia"/>
+                <w:color w:val="C00000"/>
+                <w:sz w:val="20"/>
+                <w:szCs w:val="20"/>
+                <w:lang w:eastAsia="ja-JP"/>
+              </w:rPr>
+            </w:pPr>
+            <w:r>
+              <w:rPr>
+                <w:rFonts w:ascii="Arial" w:hAnsi="Arial" w:cs="Arial"/>
+                <w:color w:val="C00000"/>
+                <w:sz w:val="20"/>
+                <w:szCs w:val="20"/>
+                <w:lang w:eastAsia="ja-JP"/>
+              </w:rPr>
+              <w:t>G</w:t>
+            </w:r>
+            <w:r>
+              <w:rPr>
+                <w:rFonts w:ascii="Arial" w:hAnsi="Arial" w:cs="Arial" w:hint="eastAsia"/>
+                <w:color w:val="C00000"/>
+                <w:sz w:val="20"/>
+                <w:szCs w:val="20"/>
+                <w:lang w:eastAsia="ja-JP"/>
+              </w:rPr>
+              <w:t>o to home page (&lt;user-specific localhost URL&gt;/</w:t>
+            </w:r>
+            <w:proofErr w:type="spellStart"/>
+            <w:r>
+              <w:rPr>
+                <w:rFonts w:ascii="Arial" w:hAnsi="Arial" w:cs="Arial" w:hint="eastAsia"/>
+                <w:color w:val="C00000"/>
+                <w:sz w:val="20"/>
+                <w:szCs w:val="20"/>
+                <w:lang w:eastAsia="ja-JP"/>
+              </w:rPr>
+              <w:t>MoffatBay</w:t>
+            </w:r>
+            <w:proofErr w:type="spellEnd"/>
+            <w:r>
+              <w:rPr>
+                <w:rFonts w:ascii="Arial" w:hAnsi="Arial" w:cs="Arial" w:hint="eastAsia"/>
+                <w:color w:val="C00000"/>
+                <w:sz w:val="20"/>
+                <w:szCs w:val="20"/>
+                <w:lang w:eastAsia="ja-JP"/>
+              </w:rPr>
+              <w:t>/</w:t>
+            </w:r>
+            <w:proofErr w:type="spellStart"/>
+            <w:r>
+              <w:rPr>
+                <w:rFonts w:ascii="Arial" w:hAnsi="Arial" w:cs="Arial" w:hint="eastAsia"/>
+                <w:color w:val="C00000"/>
+                <w:sz w:val="20"/>
+                <w:szCs w:val="20"/>
+                <w:lang w:eastAsia="ja-JP"/>
+              </w:rPr>
+              <w:t>index.jsp</w:t>
+            </w:r>
+            <w:proofErr w:type="spellEnd"/>
+            <w:r>
+              <w:rPr>
+                <w:rFonts w:ascii="Arial" w:hAnsi="Arial" w:cs="Arial" w:hint="eastAsia"/>
+                <w:color w:val="C00000"/>
+                <w:sz w:val="20"/>
+                <w:szCs w:val="20"/>
+                <w:lang w:eastAsia="ja-JP"/>
+              </w:rPr>
+              <w:t>)</w:t>
             </w:r>
           </w:p>
         </w:tc>
@@ -5363,20 +5442,22 @@
             <w:pPr>
               <w:spacing w:before="80" w:after="80"/>
               <w:rPr>
-                <w:rFonts w:ascii="Arial" w:hAnsi="Arial" w:cs="Arial"/>
-                <w:color w:val="C00000"/>
-                <w:sz w:val="20"/>
-                <w:szCs w:val="20"/>
-              </w:rPr>
-            </w:pPr>
-            <w:r>
-              <w:rPr>
-                <w:rFonts w:ascii="Arial" w:hAnsi="Arial" w:cs="Arial"/>
-                <w:color w:val="C00000"/>
-                <w:sz w:val="20"/>
-                <w:szCs w:val="20"/>
-              </w:rPr>
-              <w:t>&lt;Enter the expected results&gt;</w:t>
+                <w:rFonts w:ascii="Arial" w:hAnsi="Arial" w:cs="Arial" w:hint="eastAsia"/>
+                <w:color w:val="C00000"/>
+                <w:sz w:val="20"/>
+                <w:szCs w:val="20"/>
+                <w:lang w:eastAsia="ja-JP"/>
+              </w:rPr>
+            </w:pPr>
+            <w:r>
+              <w:rPr>
+                <w:rFonts w:ascii="Arial" w:hAnsi="Arial" w:cs="Arial" w:hint="eastAsia"/>
+                <w:color w:val="C00000"/>
+                <w:sz w:val="20"/>
+                <w:szCs w:val="20"/>
+                <w:lang w:eastAsia="ja-JP"/>
+              </w:rPr>
+              <w:t>Home page loads</w:t>
             </w:r>
           </w:p>
         </w:tc>
@@ -5388,20 +5469,22 @@
             <w:pPr>
               <w:spacing w:before="80" w:after="80"/>
               <w:rPr>
-                <w:rFonts w:ascii="Arial" w:hAnsi="Arial" w:cs="Arial"/>
-                <w:color w:val="C00000"/>
-                <w:sz w:val="20"/>
-                <w:szCs w:val="20"/>
-              </w:rPr>
-            </w:pPr>
-            <w:r>
-              <w:rPr>
-                <w:rFonts w:ascii="Arial" w:hAnsi="Arial" w:cs="Arial"/>
-                <w:color w:val="C00000"/>
-                <w:sz w:val="20"/>
-                <w:szCs w:val="20"/>
-              </w:rPr>
-              <w:t>&lt;yes/no&gt;</w:t>
+                <w:rFonts w:ascii="Arial" w:hAnsi="Arial" w:cs="Arial" w:hint="eastAsia"/>
+                <w:color w:val="C00000"/>
+                <w:sz w:val="20"/>
+                <w:szCs w:val="20"/>
+                <w:lang w:eastAsia="ja-JP"/>
+              </w:rPr>
+            </w:pPr>
+            <w:r>
+              <w:rPr>
+                <w:rFonts w:ascii="Arial" w:hAnsi="Arial" w:cs="Arial" w:hint="eastAsia"/>
+                <w:color w:val="C00000"/>
+                <w:sz w:val="20"/>
+                <w:szCs w:val="20"/>
+                <w:lang w:eastAsia="ja-JP"/>
+              </w:rPr>
+              <w:t>yes</w:t>
             </w:r>
           </w:p>
         </w:tc>
@@ -5466,20 +5549,52 @@
             <w:pPr>
               <w:spacing w:before="80" w:after="80"/>
               <w:rPr>
-                <w:rFonts w:ascii="Arial" w:hAnsi="Arial" w:cs="Arial"/>
-                <w:color w:val="C00000"/>
-                <w:sz w:val="20"/>
-                <w:szCs w:val="20"/>
-              </w:rPr>
-            </w:pPr>
-            <w:r>
-              <w:rPr>
-                <w:rFonts w:ascii="Arial" w:hAnsi="Arial" w:cs="Arial"/>
-                <w:color w:val="C00000"/>
-                <w:sz w:val="20"/>
-                <w:szCs w:val="20"/>
-              </w:rPr>
-              <w:t>&lt;Enter an action&gt;</w:t>
+                <w:rFonts w:ascii="Arial" w:hAnsi="Arial" w:cs="Arial" w:hint="eastAsia"/>
+                <w:color w:val="C00000"/>
+                <w:sz w:val="20"/>
+                <w:szCs w:val="20"/>
+                <w:lang w:eastAsia="ja-JP"/>
+              </w:rPr>
+            </w:pPr>
+            <w:r>
+              <w:rPr>
+                <w:rFonts w:ascii="Arial" w:hAnsi="Arial" w:cs="Arial" w:hint="eastAsia"/>
+                <w:color w:val="C00000"/>
+                <w:sz w:val="20"/>
+                <w:szCs w:val="20"/>
+                <w:lang w:eastAsia="ja-JP"/>
+              </w:rPr>
+              <w:t xml:space="preserve">Click </w:t>
+            </w:r>
+            <w:r>
+              <w:rPr>
+                <w:rFonts w:ascii="Arial" w:hAnsi="Arial" w:cs="Arial"/>
+                <w:color w:val="C00000"/>
+                <w:sz w:val="20"/>
+                <w:szCs w:val="20"/>
+                <w:lang w:eastAsia="ja-JP"/>
+              </w:rPr>
+              <w:t>“</w:t>
+            </w:r>
+            <w:r>
+              <w:rPr>
+                <w:rFonts w:ascii="Arial" w:hAnsi="Arial" w:cs="Arial" w:hint="eastAsia"/>
+                <w:color w:val="C00000"/>
+                <w:sz w:val="20"/>
+                <w:szCs w:val="20"/>
+                <w:lang w:eastAsia="ja-JP"/>
+              </w:rPr>
+              <w:t>About Us</w:t>
+            </w:r>
+            <w:r>
+              <w:rPr>
+                <w:rFonts w:ascii="Arial" w:hAnsi="Arial" w:cs="Arial"/>
+                <w:color w:val="C00000"/>
+                <w:sz w:val="20"/>
+                <w:szCs w:val="20"/>
+                <w:lang w:eastAsia="ja-JP"/>
+              </w:rPr>
+              <w:t>”</w:t>
             </w:r>
           </w:p>
         </w:tc>
@@ -5491,20 +5606,22 @@
             <w:pPr>
               <w:spacing w:before="80" w:after="80"/>
               <w:rPr>
-                <w:rFonts w:ascii="Arial" w:hAnsi="Arial" w:cs="Arial"/>
-                <w:color w:val="C00000"/>
-                <w:sz w:val="20"/>
-                <w:szCs w:val="20"/>
-              </w:rPr>
-            </w:pPr>
-            <w:r>
-              <w:rPr>
-                <w:rFonts w:ascii="Arial" w:hAnsi="Arial" w:cs="Arial"/>
-                <w:color w:val="C00000"/>
-                <w:sz w:val="20"/>
-                <w:szCs w:val="20"/>
-              </w:rPr>
-              <w:t>&lt;Enter the expected results&gt;</w:t>
+                <w:rFonts w:ascii="Arial" w:hAnsi="Arial" w:cs="Arial" w:hint="eastAsia"/>
+                <w:color w:val="C00000"/>
+                <w:sz w:val="20"/>
+                <w:szCs w:val="20"/>
+                <w:lang w:eastAsia="ja-JP"/>
+              </w:rPr>
+            </w:pPr>
+            <w:r>
+              <w:rPr>
+                <w:rFonts w:ascii="Arial" w:hAnsi="Arial" w:cs="Arial" w:hint="eastAsia"/>
+                <w:color w:val="C00000"/>
+                <w:sz w:val="20"/>
+                <w:szCs w:val="20"/>
+                <w:lang w:eastAsia="ja-JP"/>
+              </w:rPr>
+              <w:t>About Us page loads</w:t>
             </w:r>
           </w:p>
         </w:tc>
@@ -5516,20 +5633,22 @@
             <w:pPr>
               <w:spacing w:before="80" w:after="80"/>
               <w:rPr>
-                <w:rFonts w:ascii="Arial" w:hAnsi="Arial" w:cs="Arial"/>
-                <w:color w:val="C00000"/>
-                <w:sz w:val="20"/>
-                <w:szCs w:val="20"/>
-              </w:rPr>
-            </w:pPr>
-            <w:r>
-              <w:rPr>
-                <w:rFonts w:ascii="Arial" w:hAnsi="Arial" w:cs="Arial"/>
-                <w:color w:val="C00000"/>
-                <w:sz w:val="20"/>
-                <w:szCs w:val="20"/>
-              </w:rPr>
-              <w:t>&lt;yes/no&gt;</w:t>
+                <w:rFonts w:ascii="Arial" w:hAnsi="Arial" w:cs="Arial" w:hint="eastAsia"/>
+                <w:color w:val="C00000"/>
+                <w:sz w:val="20"/>
+                <w:szCs w:val="20"/>
+                <w:lang w:eastAsia="ja-JP"/>
+              </w:rPr>
+            </w:pPr>
+            <w:r>
+              <w:rPr>
+                <w:rFonts w:ascii="Arial" w:hAnsi="Arial" w:cs="Arial" w:hint="eastAsia"/>
+                <w:color w:val="C00000"/>
+                <w:sz w:val="20"/>
+                <w:szCs w:val="20"/>
+                <w:lang w:eastAsia="ja-JP"/>
+              </w:rPr>
+              <w:t>yes</w:t>
             </w:r>
           </w:p>
         </w:tc>
@@ -5594,20 +5713,22 @@
             <w:pPr>
               <w:spacing w:before="80" w:after="80"/>
               <w:rPr>
-                <w:rFonts w:ascii="Arial" w:hAnsi="Arial" w:cs="Arial"/>
-                <w:color w:val="C00000"/>
-                <w:sz w:val="20"/>
-                <w:szCs w:val="20"/>
-              </w:rPr>
-            </w:pPr>
-            <w:r>
-              <w:rPr>
-                <w:rFonts w:ascii="Arial" w:hAnsi="Arial" w:cs="Arial"/>
-                <w:color w:val="C00000"/>
-                <w:sz w:val="20"/>
-                <w:szCs w:val="20"/>
-              </w:rPr>
-              <w:t>&lt;Enter an action&gt;</w:t>
+                <w:rFonts w:ascii="Arial" w:hAnsi="Arial" w:cs="Arial" w:hint="eastAsia"/>
+                <w:color w:val="C00000"/>
+                <w:sz w:val="20"/>
+                <w:szCs w:val="20"/>
+                <w:lang w:eastAsia="ja-JP"/>
+              </w:rPr>
+            </w:pPr>
+            <w:r>
+              <w:rPr>
+                <w:rFonts w:ascii="Arial" w:hAnsi="Arial" w:cs="Arial" w:hint="eastAsia"/>
+                <w:color w:val="C00000"/>
+                <w:sz w:val="20"/>
+                <w:szCs w:val="20"/>
+                <w:lang w:eastAsia="ja-JP"/>
+              </w:rPr>
+              <w:t>Confirm About Us page content is present</w:t>
             </w:r>
           </w:p>
         </w:tc>
@@ -5627,12 +5748,13 @@
             </w:pPr>
             <w:r>
               <w:rPr>
-                <w:rFonts w:ascii="Arial" w:hAnsi="Arial" w:cs="Arial"/>
-                <w:color w:val="C00000"/>
-                <w:sz w:val="20"/>
-                <w:szCs w:val="20"/>
-              </w:rPr>
-              <w:t>&lt;Enter the expected results&gt;</w:t>
+                <w:rFonts w:ascii="Arial" w:hAnsi="Arial" w:cs="Arial" w:hint="eastAsia"/>
+                <w:color w:val="C00000"/>
+                <w:sz w:val="20"/>
+                <w:szCs w:val="20"/>
+                <w:lang w:eastAsia="ja-JP"/>
+              </w:rPr>
+              <w:t>Page contents load (Hero image, Out Lodge section, Our Story section, images for Our Staff, Our Home, and Our Backyard)</w:t>
             </w:r>
           </w:p>
         </w:tc>
@@ -5644,20 +5766,22 @@
             <w:pPr>
               <w:spacing w:before="80" w:after="80"/>
               <w:rPr>
-                <w:rFonts w:ascii="Arial" w:hAnsi="Arial" w:cs="Arial"/>
-                <w:color w:val="C00000"/>
-                <w:sz w:val="20"/>
-                <w:szCs w:val="20"/>
-              </w:rPr>
-            </w:pPr>
-            <w:r>
-              <w:rPr>
-                <w:rFonts w:ascii="Arial" w:hAnsi="Arial" w:cs="Arial"/>
-                <w:color w:val="C00000"/>
-                <w:sz w:val="20"/>
-                <w:szCs w:val="20"/>
-              </w:rPr>
-              <w:t>&lt;yes/no&gt;</w:t>
+                <w:rFonts w:ascii="Arial" w:hAnsi="Arial" w:cs="Arial" w:hint="eastAsia"/>
+                <w:color w:val="C00000"/>
+                <w:sz w:val="20"/>
+                <w:szCs w:val="20"/>
+                <w:lang w:eastAsia="ja-JP"/>
+              </w:rPr>
+            </w:pPr>
+            <w:r>
+              <w:rPr>
+                <w:rFonts w:ascii="Arial" w:hAnsi="Arial" w:cs="Arial" w:hint="eastAsia"/>
+                <w:color w:val="C00000"/>
+                <w:sz w:val="20"/>
+                <w:szCs w:val="20"/>
+                <w:lang w:eastAsia="ja-JP"/>
+              </w:rPr>
+              <w:t>yes</w:t>
             </w:r>
           </w:p>
         </w:tc>
@@ -6250,7 +6374,7 @@
   <w:docDefaults>
     <w:rPrDefault>
       <w:rPr>
-        <w:rFonts w:asciiTheme="minorHAnsi" w:eastAsiaTheme="minorHAnsi" w:hAnsiTheme="minorHAnsi" w:cstheme="minorBidi"/>
+        <w:rFonts w:asciiTheme="minorHAnsi" w:eastAsiaTheme="minorEastAsia" w:hAnsiTheme="minorHAnsi" w:cstheme="minorBidi"/>
         <w:sz w:val="22"/>
         <w:szCs w:val="22"/>
         <w:lang w:val="en-US" w:eastAsia="en-US" w:bidi="ar-SA"/>

</xml_diff>